<commit_message>
Propuesta final cerradora: acelerador con dos puertas (16 matriculas 8+8 al 30-sep O 20 al 5-oct -> 10pct retroactivo), grupos 13-14 max 16, cupo 21+ = MISMA cohorte a tarifa plena 3.511.000 (sin opcion de espera — invitaba a aplazar), 1 pagina
Co-Authored-By: Claude Fable 5 <noreply@anthropic.com>
Claude-Session: https://claude.ai/code/session_018H7C5dx3NvDfXiv3CfhPMa
</commit_message>
<xml_diff>
--- a/recursos/comercial/INDUCCION_COMERCIAL/PROPUESTA_CERRADORA_HIGH_TICKET.docx
+++ b/recursos/comercial/INDUCCION_COMERCIAL/PROPUESTA_CERRADORA_HIGH_TICKET.docx
@@ -29,7 +29,7 @@
     </w:p>
     <w:p>
       <w:pPr>
-        <w:spacing w:before="120" w:after="40"/>
+        <w:spacing w:before="80" w:after="30"/>
       </w:pPr>
       <w:r>
         <w:rPr>
@@ -42,31 +42,31 @@
     </w:p>
     <w:p>
       <w:pPr>
-        <w:spacing w:after="40"/>
+        <w:spacing w:after="30"/>
       </w:pPr>
       <w:r>
         <w:rPr>
           <w:b/>
-          <w:sz w:val="21"/>
+          <w:sz w:val="20"/>
         </w:rPr>
         <w:t>ARRANQUE A1+A2: los dos primeros niveles de inglés COMPLETOS — 200 horas presenciales, libros y certificado oficial por nivel — $2.990.000, precio de lanzamiento. Cohorte inicia el 5 DE OCTUBRE.</w:t>
       </w:r>
     </w:p>
     <w:p>
       <w:pPr>
-        <w:spacing w:after="40"/>
+        <w:spacing w:after="30"/>
       </w:pPr>
       <w:r>
         <w:rPr>
           <w:b w:val="0"/>
-          <w:sz w:val="21"/>
+          <w:sz w:val="20"/>
         </w:rPr>
         <w:t>Y el high ticket detrás: el PROGRAMA COMPLETO (A1 a B2, 575 horas) con beca del Fondo según el perfil del cliente — caso típico (perfil General, de contado): $5.913.280. Perfiles de menores ingresos pueden acceder a becas mayores, con soportes y cupos. El cierre doble ofrece los dos caminos: las dos respuestas son sí.</w:t>
       </w:r>
     </w:p>
     <w:p>
       <w:pPr>
-        <w:spacing w:before="120" w:after="40"/>
+        <w:spacing w:before="80" w:after="30"/>
       </w:pPr>
       <w:r>
         <w:rPr>
@@ -79,48 +79,48 @@
     </w:p>
     <w:p>
       <w:pPr>
-        <w:spacing w:after="40"/>
+        <w:spacing w:after="30"/>
       </w:pPr>
       <w:r>
         <w:rPr>
           <w:b w:val="0"/>
-          <w:sz w:val="21"/>
+          <w:sz w:val="20"/>
         </w:rPr>
         <w:t>· GARANTÍA DE APRENDIZAJE POR ESCRITO en el contrato — única en la ciudad. Mata la objeción #1 ("¿y si no aprendo?").</w:t>
       </w:r>
     </w:p>
     <w:p>
       <w:pPr>
-        <w:spacing w:after="40"/>
+        <w:spacing w:after="30"/>
       </w:pPr>
       <w:r>
         <w:rPr>
           <w:b w:val="0"/>
-          <w:sz w:val="21"/>
+          <w:sz w:val="20"/>
         </w:rPr>
         <w:t>· MÓDULO DE GRADUACIÓN al terminar A2, a elección: el estudiante sale con su PÁGINA WEB publicada y su primer mensaje de venta en inglés — o con su aplicación lista para irse a trabajar afuera (video + entrevista ensayada).</w:t>
       </w:r>
     </w:p>
     <w:p>
       <w:pPr>
-        <w:spacing w:after="40"/>
+        <w:spacing w:after="30"/>
       </w:pPr>
       <w:r>
         <w:rPr>
           <w:b w:val="0"/>
-          <w:sz w:val="21"/>
+          <w:sz w:val="20"/>
         </w:rPr>
         <w:t>· Institución con licencia desde 2012, programas registrados, certificación ICONTEC.</w:t>
       </w:r>
     </w:p>
     <w:p>
       <w:pPr>
-        <w:spacing w:after="40"/>
+        <w:spacing w:after="30"/>
       </w:pPr>
       <w:r>
         <w:rPr>
           <w:b w:val="0"/>
-          <w:sz w:val="21"/>
+          <w:sz w:val="20"/>
         </w:rPr>
         <w:t>· Precio de lanzamiento + contador de cupos REAL: la urgencia no es teatro.</w:t>
       </w:r>
@@ -144,7 +144,7 @@
             <w:r>
               <w:rPr>
                 <w:b/>
-                <w:sz w:val="21"/>
+                <w:sz w:val="20"/>
               </w:rPr>
               <w:t>No vendemos inglés. Vendemos a dónde te lleva — con garantía firmada.</w:t>
             </w:r>
@@ -164,7 +164,7 @@
     </w:p>
     <w:p>
       <w:pPr>
-        <w:spacing w:before="120" w:after="40"/>
+        <w:spacing w:before="80" w:after="30"/>
       </w:pPr>
       <w:r>
         <w:rPr>
@@ -177,19 +177,19 @@
     </w:p>
     <w:p>
       <w:pPr>
-        <w:spacing w:after="40"/>
+        <w:spacing w:after="30"/>
       </w:pPr>
       <w:r>
         <w:rPr>
           <w:b/>
-          <w:sz w:val="21"/>
+          <w:sz w:val="20"/>
         </w:rPr>
-        <w:t>20 CUPOS ANTES DEL 5 DE OCTUBRE: 10 en la jornada de la MAÑANA (8:00-12:00, super intensivo) + 10 en la NOCHE (6:30-8:30).</w:t>
+        <w:t>ABRIR LAS DOS JORNADAS — mañana (8:00-12:00) y noche (6:30-8:30) — con grupos de 13-14 estudiantes (máx. 16). Los primeros 20 cupos van a precio de lanzamiento; la cohorte inicia el 5 de octubre.</w:t>
       </w:r>
     </w:p>
     <w:p>
       <w:pPr>
-        <w:spacing w:before="120" w:after="40"/>
+        <w:spacing w:before="80" w:after="30"/>
       </w:pPr>
       <w:r>
         <w:rPr>
@@ -202,55 +202,55 @@
     </w:p>
     <w:p>
       <w:pPr>
-        <w:spacing w:after="40"/>
+        <w:spacing w:after="30"/>
       </w:pPr>
       <w:r>
         <w:rPr>
           <w:b/>
-          <w:sz w:val="21"/>
+          <w:sz w:val="20"/>
         </w:rPr>
         <w:t>· Comisión: 8% del recaudo por TODA venta de tu canal (tu contenido, tu red, y la pauta financiada). Pago contra plata efectiva en caja.</w:t>
       </w:r>
     </w:p>
     <w:p>
       <w:pPr>
-        <w:spacing w:after="40"/>
+        <w:spacing w:after="30"/>
       </w:pPr>
       <w:r>
         <w:rPr>
           <w:b/>
-          <w:sz w:val="21"/>
+          <w:sz w:val="20"/>
         </w:rPr>
-        <w:t>· ACELERADOR: si completas los 20 cupos antes del 5 de octubre, toda la serie se reliquida al 10% — retroactivo.</w:t>
+        <w:t>· ACELERADOR — dos puertas al 10% retroactivo sobre TODA tu serie: (a) el 30 DE SEPTIEMBRE ambas jornadas abiertas con 16 matrículas en total (mínimo 8 y 8), o (b) los 20 cupos completos antes del 5 de octubre. Por debajo: 8%.</w:t>
       </w:r>
     </w:p>
     <w:p>
       <w:pPr>
-        <w:spacing w:after="40"/>
+        <w:spacing w:after="30"/>
       </w:pPr>
       <w:r>
         <w:rPr>
           <w:b w:val="0"/>
-          <w:sz w:val="21"/>
+          <w:sz w:val="20"/>
         </w:rPr>
         <w:t>· PAUTA FINANCIADA POR HEIIU sobre tus piezas, en tus canales: apruebas pieza + presupuesto con gerencia antes de publicar; tope inicial $1.000.000/mes, revisable por resultados; factura de la plataforma como soporte del gasto.</w:t>
       </w:r>
     </w:p>
     <w:p>
       <w:pPr>
-        <w:spacing w:after="40"/>
+        <w:spacing w:after="30"/>
       </w:pPr>
       <w:r>
         <w:rPr>
           <w:b w:val="0"/>
-          <w:sz w:val="21"/>
+          <w:sz w:val="20"/>
         </w:rPr>
         <w:t>· Sin exclusividad, sin horarios, sin básico. Leads que la casa te entregue: 5%.</w:t>
       </w:r>
     </w:p>
     <w:p>
       <w:pPr>
-        <w:spacing w:before="120" w:after="40"/>
+        <w:spacing w:before="80" w:after="30"/>
       </w:pPr>
       <w:r>
         <w:rPr>
@@ -263,19 +263,19 @@
     </w:p>
     <w:p>
       <w:pPr>
-        <w:spacing w:after="40"/>
+        <w:spacing w:after="30"/>
       </w:pPr>
       <w:r>
         <w:rPr>
           <w:b w:val="0"/>
-          <w:sz w:val="21"/>
+          <w:sz w:val="20"/>
         </w:rPr>
-        <w:t>El contador de cupos es compartido y gerencia lo actualiza a diario. Con el contador en 20, cambia el guion — no se pide permiso: toda venta siguiente se cierra como COHORTE SIGUIENTE con el precio de lanzamiento CONGELADO — el cliente paga los $2.990.000 de hoy aunque esa cohorte salga después a precio normal — y comisiona igual. Lo único prohibido: prometer cupo del 5 de octubre cuando ya van 20.</w:t>
+        <w:t>El contador es compartido y gerencia lo actualiza a diario. Los 20 cupos de lanzamiento son a $2.990.000. Del cupo 21 en adelante se sigue vendiendo ESTA MISMA cohorte, a la tarifa plena de los dos niveles: $3.511.000 (grupos hasta de 16). Todo comisiona igual — y la urgencia se vuelve más fuerte: agotado el lanzamiento, el mismo programa cuesta $521.000 más. Lo único prohibido: ofrecer el precio de lanzamiento en esta cohorte cuando el contador ya va en 20.</w:t>
       </w:r>
     </w:p>
     <w:p>
       <w:pPr>
-        <w:spacing w:before="120" w:after="40"/>
+        <w:spacing w:before="80" w:after="30"/>
       </w:pPr>
       <w:r>
         <w:rPr>
@@ -288,19 +288,19 @@
     </w:p>
     <w:p>
       <w:pPr>
-        <w:spacing w:after="40"/>
+        <w:spacing w:after="30"/>
       </w:pPr>
       <w:r>
         <w:rPr>
           <w:b w:val="0"/>
-          <w:sz w:val="21"/>
+          <w:sz w:val="20"/>
         </w:rPr>
         <w:t>Sin descuentos inventados (la única flexibilidad es la escrita) · sin promesas de empleo, visa o "bilingüe en X meses" · la palabra "patrocinio" no existe: es beca del Fondo · toda venta se registra en la planilla comercial para comisionar.</w:t>
       </w:r>
     </w:p>
     <w:p>
       <w:pPr>
-        <w:spacing w:before="120" w:after="40"/>
+        <w:spacing w:before="80" w:after="30"/>
       </w:pPr>
       <w:r>
         <w:rPr>
@@ -313,12 +313,12 @@
     </w:p>
     <w:p>
       <w:pPr>
-        <w:spacing w:after="40"/>
+        <w:spacing w:after="30"/>
       </w:pPr>
       <w:r>
         <w:rPr>
           <w:b/>
-          <w:sz w:val="21"/>
+          <w:sz w:val="20"/>
         </w:rPr>
         <w:t>1. Contrato de prestación de servicios con confidencialidad — esta semana. 2. Firmado = manual de venta completo + planilla + piezas, el mismo día. 3. Primera venta: esta misma semana.</w:t>
       </w:r>
@@ -711,7 +711,7 @@
     <w:rsid w:val="00FC693F"/>
     <w:rPr>
       <w:rFonts w:ascii="Calibri" w:hAnsi="Calibri"/>
-      <w:sz w:val="21"/>
+      <w:sz w:val="20"/>
     </w:rPr>
   </w:style>
   <w:style w:type="paragraph" w:styleId="Header">

</xml_diff>

<commit_message>
Propuesta cerradora definitiva: bono grupos llenos \$2M (remate bolsillo \$2.5M), cupo 21+ tarifa plena \$3.511.000 con excepcion contado-hoy = precio lanzamiento, escalera 8 -> 10 retroactivo a todo
Co-Authored-By: Claude Fable 5 <noreply@anthropic.com>
Claude-Session: https://claude.ai/code/session_018H7C5dx3NvDfXiv3CfhPMa
</commit_message>
<xml_diff>
--- a/recursos/comercial/INDUCCION_COMERCIAL/PROPUESTA_CERRADORA_HIGH_TICKET.docx
+++ b/recursos/comercial/INDUCCION_COMERCIAL/PROPUESTA_CERRADORA_HIGH_TICKET.docx
@@ -230,6 +230,18 @@
       </w:pPr>
       <w:r>
         <w:rPr>
+          <w:b/>
+          <w:sz w:val="20"/>
+        </w:rPr>
+        <w:t>· BONO GRUPOS LLENOS: 28 matrículas (14 + 14) al 30 de septiembre = $2.000.000 de bono adicional, encima del 10%.</w:t>
+      </w:r>
+    </w:p>
+    <w:p>
+      <w:pPr>
+        <w:spacing w:after="30"/>
+      </w:pPr>
+      <w:r>
+        <w:rPr>
           <w:b w:val="0"/>
           <w:sz w:val="20"/>
         </w:rPr>
@@ -270,7 +282,7 @@
           <w:b w:val="0"/>
           <w:sz w:val="20"/>
         </w:rPr>
-        <w:t>El contador es compartido y gerencia lo actualiza a diario. Los 20 cupos de lanzamiento son a $2.990.000. Del cupo 21 en adelante se sigue vendiendo ESTA MISMA cohorte, a la tarifa plena de los dos niveles: $3.511.000 (grupos hasta de 16). Todo comisiona igual — y la urgencia se vuelve más fuerte: agotado el lanzamiento, el mismo programa cuesta $521.000 más. Lo único prohibido: ofrecer el precio de lanzamiento en esta cohorte cuando el contador ya va en 20.</w:t>
+        <w:t>El contador es compartido y gerencia lo actualiza a diario. Los 20 cupos de lanzamiento son a $2.990.000. Del cupo 21 en adelante se sigue vendiendo ESTA MISMA cohorte (grupos hasta de 16) a la tarifa plena de los dos niveles: $3.511.000. ÚNICA excepción, escrita: pago de CONTADO completo el mismo día = se mantiene el precio de lanzamiento ($2.990.000). A cuotas: tarifa plena. Todo comisiona igual — y la urgencia gana un segundo filo: agotados los 20, el precio de lanzamiento solo existe pagando hoy de contado. Lo único prohibido: ofrecer el precio de lanzamiento en esta cohorte cuando el contador ya va en 20.</w:t>
       </w:r>
     </w:p>
     <w:p>

</xml_diff>

<commit_message>
Propuesta con tabla LO QUE GANAS TU (20 Arranques ~6M / 10+10 completos ~8.9M / grupos llenos+bono ~10.8M) — 1 pagina, comprimida
Co-Authored-By: Claude Fable 5 <noreply@anthropic.com>
Claude-Session: https://claude.ai/code/session_018H7C5dx3NvDfXiv3CfhPMa
</commit_message>
<xml_diff>
--- a/recursos/comercial/INDUCCION_COMERCIAL/PROPUESTA_CERRADORA_HIGH_TICKET.docx
+++ b/recursos/comercial/INDUCCION_COMERCIAL/PROPUESTA_CERRADORA_HIGH_TICKET.docx
@@ -29,13 +29,13 @@
     </w:p>
     <w:p>
       <w:pPr>
-        <w:spacing w:before="80" w:after="30"/>
+        <w:spacing w:before="60" w:after="20"/>
       </w:pPr>
       <w:r>
         <w:rPr>
           <w:b/>
           <w:color w:val="E54C09"/>
-          <w:sz w:val="24"/>
+          <w:sz w:val="23"/>
         </w:rPr>
         <w:t>EL PRODUCTO</w:t>
       </w:r>
@@ -47,7 +47,7 @@
       <w:r>
         <w:rPr>
           <w:b/>
-          <w:sz w:val="20"/>
+          <w:sz w:val="19"/>
         </w:rPr>
         <w:t>ARRANQUE A1+A2: los dos primeros niveles de inglés COMPLETOS — 200 horas presenciales, libros y certificado oficial por nivel — $2.990.000, precio de lanzamiento. Cohorte inicia el 5 DE OCTUBRE.</w:t>
       </w:r>
@@ -59,20 +59,20 @@
       <w:r>
         <w:rPr>
           <w:b w:val="0"/>
-          <w:sz w:val="20"/>
+          <w:sz w:val="19"/>
         </w:rPr>
         <w:t>Y el high ticket detrás: el PROGRAMA COMPLETO (A1 a B2, 575 horas) con beca del Fondo según el perfil del cliente — caso típico (perfil General, de contado): $5.913.280. Perfiles de menores ingresos pueden acceder a becas mayores, con soportes y cupos. El cierre doble ofrece los dos caminos: las dos respuestas son sí.</w:t>
       </w:r>
     </w:p>
     <w:p>
       <w:pPr>
-        <w:spacing w:before="80" w:after="30"/>
+        <w:spacing w:before="60" w:after="20"/>
       </w:pPr>
       <w:r>
         <w:rPr>
           <w:b/>
           <w:color w:val="E54C09"/>
-          <w:sz w:val="24"/>
+          <w:sz w:val="23"/>
         </w:rPr>
         <w:t>POR QUÉ CIERRA (los diferenciales)</w:t>
       </w:r>
@@ -84,9 +84,9 @@
       <w:r>
         <w:rPr>
           <w:b w:val="0"/>
-          <w:sz w:val="20"/>
+          <w:sz w:val="19"/>
         </w:rPr>
-        <w:t>· GARANTÍA DE APRENDIZAJE POR ESCRITO en el contrato — única en la ciudad. Mata la objeción #1 ("¿y si no aprendo?").</w:t>
+        <w:t>· GARANTÍA DE APRENDIZAJE POR ESCRITO en el contrato — única en la ciudad: mata la objeción #1.</w:t>
       </w:r>
     </w:p>
     <w:p>
@@ -96,9 +96,9 @@
       <w:r>
         <w:rPr>
           <w:b w:val="0"/>
-          <w:sz w:val="20"/>
+          <w:sz w:val="19"/>
         </w:rPr>
-        <w:t>· MÓDULO DE GRADUACIÓN al terminar A2, a elección: el estudiante sale con su PÁGINA WEB publicada y su primer mensaje de venta en inglés — o con su aplicación lista para irse a trabajar afuera (video + entrevista ensayada).</w:t>
+        <w:t>· MÓDULO DE GRADUACIÓN a elección: sale con su PÁGINA WEB publicada y su primer mensaje de venta en inglés — o con su aplicación lista para irse (video + entrevista ensayada).</w:t>
       </w:r>
     </w:p>
     <w:p>
@@ -108,7 +108,7 @@
       <w:r>
         <w:rPr>
           <w:b w:val="0"/>
-          <w:sz w:val="20"/>
+          <w:sz w:val="19"/>
         </w:rPr>
         <w:t>· Institución con licencia desde 2012, programas registrados, certificación ICONTEC.</w:t>
       </w:r>
@@ -120,9 +120,120 @@
       <w:r>
         <w:rPr>
           <w:b w:val="0"/>
-          <w:sz w:val="20"/>
+          <w:sz w:val="19"/>
         </w:rPr>
         <w:t>· Precio de lanzamiento + contador de cupos REAL: la urgencia no es teatro.</w:t>
+      </w:r>
+    </w:p>
+    <w:p>
+      <w:pPr>
+        <w:spacing w:before="60" w:after="20"/>
+      </w:pPr>
+      <w:r>
+        <w:rPr>
+          <w:b/>
+          <w:color w:val="E54C09"/>
+          <w:sz w:val="23"/>
+        </w:rPr>
+        <w:t>LA META</w:t>
+      </w:r>
+    </w:p>
+    <w:p>
+      <w:pPr>
+        <w:spacing w:after="30"/>
+      </w:pPr>
+      <w:r>
+        <w:rPr>
+          <w:b/>
+          <w:sz w:val="19"/>
+        </w:rPr>
+        <w:t>ABRIR LAS DOS JORNADAS — mañana (8:00-12:00) y noche (6:30-8:30) — con grupos de 13-14 estudiantes (máx. 16). Los primeros 20 cupos van a precio de lanzamiento; la cohorte inicia el 5 de octubre.</w:t>
+      </w:r>
+    </w:p>
+    <w:p>
+      <w:pPr>
+        <w:spacing w:before="60" w:after="20"/>
+      </w:pPr>
+      <w:r>
+        <w:rPr>
+          <w:b/>
+          <w:color w:val="E54C09"/>
+          <w:sz w:val="23"/>
+        </w:rPr>
+        <w:t>EL TRATO</w:t>
+      </w:r>
+    </w:p>
+    <w:p>
+      <w:pPr>
+        <w:spacing w:after="30"/>
+      </w:pPr>
+      <w:r>
+        <w:rPr>
+          <w:b/>
+          <w:sz w:val="19"/>
+        </w:rPr>
+        <w:t>· Comisión: 8% del recaudo por TODA venta de tu canal (tu contenido, tu red, y la pauta financiada). Pago contra plata efectiva en caja.</w:t>
+      </w:r>
+    </w:p>
+    <w:p>
+      <w:pPr>
+        <w:spacing w:after="30"/>
+      </w:pPr>
+      <w:r>
+        <w:rPr>
+          <w:b/>
+          <w:sz w:val="19"/>
+        </w:rPr>
+        <w:t>· ACELERADOR — dos puertas al 10% retroactivo sobre TODA tu serie: (a) el 30 DE SEPTIEMBRE ambas jornadas abiertas con 16 matrículas en total (mínimo 8 y 8), o (b) los 20 cupos completos antes del 5 de octubre. Por debajo: 8%.</w:t>
+      </w:r>
+    </w:p>
+    <w:p>
+      <w:pPr>
+        <w:spacing w:after="30"/>
+      </w:pPr>
+      <w:r>
+        <w:rPr>
+          <w:b/>
+          <w:sz w:val="19"/>
+        </w:rPr>
+        <w:t>· BONO GRUPOS LLENOS: 28 matrículas (14 + 14) al 30 de septiembre = $2.000.000 de bono adicional, encima del 10%.</w:t>
+      </w:r>
+    </w:p>
+    <w:p>
+      <w:pPr>
+        <w:spacing w:after="30"/>
+      </w:pPr>
+      <w:r>
+        <w:rPr>
+          <w:b w:val="0"/>
+          <w:sz w:val="19"/>
+        </w:rPr>
+        <w:t>· PAUTA FINANCIADA POR HEIIU sobre tus piezas, en tus canales: apruebas pieza + presupuesto con gerencia antes de publicar; tope inicial $1.000.000/mes, revisable por resultados; factura de la plataforma como soporte del gasto.</w:t>
+      </w:r>
+    </w:p>
+    <w:p>
+      <w:pPr>
+        <w:spacing w:after="30"/>
+      </w:pPr>
+      <w:r>
+        <w:rPr>
+          <w:b w:val="0"/>
+          <w:sz w:val="19"/>
+        </w:rPr>
+        <w:t>· Sin exclusividad, sin horarios, sin básico. Leads que la casa te entregue: 5%.</w:t>
+      </w:r>
+    </w:p>
+    <w:p>
+      <w:pPr>
+        <w:spacing w:before="60" w:after="20"/>
+      </w:pPr>
+      <w:r>
+        <w:rPr>
+          <w:b/>
+          <w:color w:val="E54C09"/>
+          <w:sz w:val="23"/>
+        </w:rPr>
+        <w:t>LO QUE GANAS TÚ (con el acelerador logrado — 10%)</w:t>
       </w:r>
     </w:p>
     <w:tbl>
@@ -132,21 +243,179 @@
         <w:tblLook w:firstColumn="1" w:firstRow="1" w:lastColumn="0" w:lastRow="0" w:noHBand="0" w:noVBand="1" w:val="04A0"/>
       </w:tblPr>
       <w:tblGrid>
-        <w:gridCol w:w="10200"/>
+        <w:gridCol w:w="3400"/>
+        <w:gridCol w:w="3400"/>
+        <w:gridCol w:w="3400"/>
       </w:tblGrid>
       <w:tr>
         <w:tc>
           <w:tcPr>
-            <w:tcW w:type="dxa" w:w="10200"/>
-            <w:shd w:val="clear" w:fill="FFF8E7"/>
+            <w:tcW w:type="dxa" w:w="3400"/>
+            <w:shd w:val="clear" w:fill="E54C09"/>
           </w:tcPr>
           <w:p>
             <w:r>
               <w:rPr>
                 <w:b/>
-                <w:sz w:val="20"/>
+                <w:color w:val="FFFFFF"/>
+                <w:sz w:val="19"/>
               </w:rPr>
-              <w:t>No vendemos inglés. Vendemos a dónde te lleva — con garantía firmada.</w:t>
+              <w:t>Escenario</w:t>
+            </w:r>
+          </w:p>
+        </w:tc>
+        <w:tc>
+          <w:tcPr>
+            <w:tcW w:type="dxa" w:w="3400"/>
+            <w:shd w:val="clear" w:fill="E54C09"/>
+          </w:tcPr>
+          <w:p>
+            <w:r>
+              <w:rPr>
+                <w:b/>
+                <w:color w:val="FFFFFF"/>
+                <w:sz w:val="19"/>
+              </w:rPr>
+              <w:t>Recaudo aprox.</w:t>
+            </w:r>
+          </w:p>
+        </w:tc>
+        <w:tc>
+          <w:tcPr>
+            <w:tcW w:type="dxa" w:w="3400"/>
+            <w:shd w:val="clear" w:fill="E54C09"/>
+          </w:tcPr>
+          <w:p>
+            <w:r>
+              <w:rPr>
+                <w:b/>
+                <w:color w:val="FFFFFF"/>
+                <w:sz w:val="19"/>
+              </w:rPr>
+              <w:t>Tu comisión</w:t>
+            </w:r>
+          </w:p>
+        </w:tc>
+      </w:tr>
+      <w:tr>
+        <w:tc>
+          <w:tcPr>
+            <w:tcW w:type="dxa" w:w="3400"/>
+          </w:tcPr>
+          <w:p>
+            <w:r>
+              <w:rPr>
+                <w:sz w:val="19"/>
+              </w:rPr>
+              <w:t>20 Arranques</w:t>
+            </w:r>
+          </w:p>
+        </w:tc>
+        <w:tc>
+          <w:tcPr>
+            <w:tcW w:type="dxa" w:w="3400"/>
+          </w:tcPr>
+          <w:p>
+            <w:r>
+              <w:rPr>
+                <w:sz w:val="19"/>
+              </w:rPr>
+              <w:t>$59.8M</w:t>
+            </w:r>
+          </w:p>
+        </w:tc>
+        <w:tc>
+          <w:tcPr>
+            <w:tcW w:type="dxa" w:w="3400"/>
+          </w:tcPr>
+          <w:p>
+            <w:r>
+              <w:rPr>
+                <w:sz w:val="19"/>
+              </w:rPr>
+              <w:t>≈ $6.0M</w:t>
+            </w:r>
+          </w:p>
+        </w:tc>
+      </w:tr>
+      <w:tr>
+        <w:tc>
+          <w:tcPr>
+            <w:tcW w:type="dxa" w:w="3400"/>
+          </w:tcPr>
+          <w:p>
+            <w:r>
+              <w:rPr>
+                <w:sz w:val="19"/>
+              </w:rPr>
+              <w:t>10 Arranques + 10 programas completos</w:t>
+            </w:r>
+          </w:p>
+        </w:tc>
+        <w:tc>
+          <w:tcPr>
+            <w:tcW w:type="dxa" w:w="3400"/>
+          </w:tcPr>
+          <w:p>
+            <w:r>
+              <w:rPr>
+                <w:sz w:val="19"/>
+              </w:rPr>
+              <w:t>$89.0M</w:t>
+            </w:r>
+          </w:p>
+        </w:tc>
+        <w:tc>
+          <w:tcPr>
+            <w:tcW w:type="dxa" w:w="3400"/>
+          </w:tcPr>
+          <w:p>
+            <w:r>
+              <w:rPr>
+                <w:sz w:val="19"/>
+              </w:rPr>
+              <w:t>≈ $8.9M</w:t>
+            </w:r>
+          </w:p>
+        </w:tc>
+      </w:tr>
+      <w:tr>
+        <w:tc>
+          <w:tcPr>
+            <w:tcW w:type="dxa" w:w="3400"/>
+          </w:tcPr>
+          <w:p>
+            <w:r>
+              <w:rPr>
+                <w:sz w:val="19"/>
+              </w:rPr>
+              <w:t>Grupos llenos: 28 + bono</w:t>
+            </w:r>
+          </w:p>
+        </w:tc>
+        <w:tc>
+          <w:tcPr>
+            <w:tcW w:type="dxa" w:w="3400"/>
+          </w:tcPr>
+          <w:p>
+            <w:r>
+              <w:rPr>
+                <w:sz w:val="19"/>
+              </w:rPr>
+              <w:t>$87.9M</w:t>
+            </w:r>
+          </w:p>
+        </w:tc>
+        <w:tc>
+          <w:tcPr>
+            <w:tcW w:type="dxa" w:w="3400"/>
+          </w:tcPr>
+          <w:p>
+            <w:r>
+              <w:rPr>
+                <w:sz w:val="19"/>
+              </w:rPr>
+              <w:t>≈ $10.8M (incluye el bono)</w:t>
             </w:r>
           </w:p>
         </w:tc>
@@ -158,117 +427,19 @@
       </w:pPr>
       <w:r>
         <w:rPr>
-          <w:sz w:val="6"/>
+          <w:sz w:val="4"/>
         </w:rPr>
       </w:r>
     </w:p>
     <w:p>
       <w:pPr>
-        <w:spacing w:before="80" w:after="30"/>
+        <w:spacing w:before="60" w:after="20"/>
       </w:pPr>
       <w:r>
         <w:rPr>
           <w:b/>
           <w:color w:val="E54C09"/>
-          <w:sz w:val="24"/>
-        </w:rPr>
-        <w:t>LA META</w:t>
-      </w:r>
-    </w:p>
-    <w:p>
-      <w:pPr>
-        <w:spacing w:after="30"/>
-      </w:pPr>
-      <w:r>
-        <w:rPr>
-          <w:b/>
-          <w:sz w:val="20"/>
-        </w:rPr>
-        <w:t>ABRIR LAS DOS JORNADAS — mañana (8:00-12:00) y noche (6:30-8:30) — con grupos de 13-14 estudiantes (máx. 16). Los primeros 20 cupos van a precio de lanzamiento; la cohorte inicia el 5 de octubre.</w:t>
-      </w:r>
-    </w:p>
-    <w:p>
-      <w:pPr>
-        <w:spacing w:before="80" w:after="30"/>
-      </w:pPr>
-      <w:r>
-        <w:rPr>
-          <w:b/>
-          <w:color w:val="E54C09"/>
-          <w:sz w:val="24"/>
-        </w:rPr>
-        <w:t>EL TRATO</w:t>
-      </w:r>
-    </w:p>
-    <w:p>
-      <w:pPr>
-        <w:spacing w:after="30"/>
-      </w:pPr>
-      <w:r>
-        <w:rPr>
-          <w:b/>
-          <w:sz w:val="20"/>
-        </w:rPr>
-        <w:t>· Comisión: 8% del recaudo por TODA venta de tu canal (tu contenido, tu red, y la pauta financiada). Pago contra plata efectiva en caja.</w:t>
-      </w:r>
-    </w:p>
-    <w:p>
-      <w:pPr>
-        <w:spacing w:after="30"/>
-      </w:pPr>
-      <w:r>
-        <w:rPr>
-          <w:b/>
-          <w:sz w:val="20"/>
-        </w:rPr>
-        <w:t>· ACELERADOR — dos puertas al 10% retroactivo sobre TODA tu serie: (a) el 30 DE SEPTIEMBRE ambas jornadas abiertas con 16 matrículas en total (mínimo 8 y 8), o (b) los 20 cupos completos antes del 5 de octubre. Por debajo: 8%.</w:t>
-      </w:r>
-    </w:p>
-    <w:p>
-      <w:pPr>
-        <w:spacing w:after="30"/>
-      </w:pPr>
-      <w:r>
-        <w:rPr>
-          <w:b/>
-          <w:sz w:val="20"/>
-        </w:rPr>
-        <w:t>· BONO GRUPOS LLENOS: 28 matrículas (14 + 14) al 30 de septiembre = $2.000.000 de bono adicional, encima del 10%.</w:t>
-      </w:r>
-    </w:p>
-    <w:p>
-      <w:pPr>
-        <w:spacing w:after="30"/>
-      </w:pPr>
-      <w:r>
-        <w:rPr>
-          <w:b w:val="0"/>
-          <w:sz w:val="20"/>
-        </w:rPr>
-        <w:t>· PAUTA FINANCIADA POR HEIIU sobre tus piezas, en tus canales: apruebas pieza + presupuesto con gerencia antes de publicar; tope inicial $1.000.000/mes, revisable por resultados; factura de la plataforma como soporte del gasto.</w:t>
-      </w:r>
-    </w:p>
-    <w:p>
-      <w:pPr>
-        <w:spacing w:after="30"/>
-      </w:pPr>
-      <w:r>
-        <w:rPr>
-          <w:b w:val="0"/>
-          <w:sz w:val="20"/>
-        </w:rPr>
-        <w:t>· Sin exclusividad, sin horarios, sin básico. Leads que la casa te entregue: 5%.</w:t>
-      </w:r>
-    </w:p>
-    <w:p>
-      <w:pPr>
-        <w:spacing w:before="80" w:after="30"/>
-      </w:pPr>
-      <w:r>
-        <w:rPr>
-          <w:b/>
-          <w:color w:val="E54C09"/>
-          <w:sz w:val="24"/>
+          <w:sz w:val="23"/>
         </w:rPr>
         <w:t>LA REGLA DEL CUPO 21 (automática, sin permisos)</w:t>
       </w:r>
@@ -280,22 +451,9 @@
       <w:r>
         <w:rPr>
           <w:b w:val="0"/>
-          <w:sz w:val="20"/>
+          <w:sz w:val="19"/>
         </w:rPr>
         <w:t>El contador es compartido y gerencia lo actualiza a diario. Los 20 cupos de lanzamiento son a $2.990.000. Del cupo 21 en adelante se sigue vendiendo ESTA MISMA cohorte (grupos hasta de 16) a la tarifa plena de los dos niveles: $3.511.000. ÚNICA excepción, escrita: pago de CONTADO completo el mismo día = se mantiene el precio de lanzamiento ($2.990.000). A cuotas: tarifa plena. Todo comisiona igual — y la urgencia gana un segundo filo: agotados los 20, el precio de lanzamiento solo existe pagando hoy de contado. Lo único prohibido: ofrecer el precio de lanzamiento en esta cohorte cuando el contador ya va en 20.</w:t>
-      </w:r>
-    </w:p>
-    <w:p>
-      <w:pPr>
-        <w:spacing w:before="80" w:after="30"/>
-      </w:pPr>
-      <w:r>
-        <w:rPr>
-          <w:b/>
-          <w:color w:val="E54C09"/>
-          <w:sz w:val="24"/>
-        </w:rPr>
-        <w:t>REGLAS DE LA CASA (innegociables)</w:t>
       </w:r>
     </w:p>
     <w:p>
@@ -304,21 +462,21 @@
       </w:pPr>
       <w:r>
         <w:rPr>
-          <w:b w:val="0"/>
-          <w:sz w:val="20"/>
+          <w:b/>
+          <w:sz w:val="19"/>
         </w:rPr>
-        <w:t>Sin descuentos inventados (la única flexibilidad es la escrita) · sin promesas de empleo, visa o "bilingüe en X meses" · la palabra "patrocinio" no existe: es beca del Fondo · toda venta se registra en la planilla comercial para comisionar.</w:t>
+        <w:t>REGLAS INNEGOCIABLES: sin descuentos inventados · sin promesas de empleo/visa · se dice beca del Fondo (jamás patrocinio) · toda venta se registra en planilla para comisionar.</w:t>
       </w:r>
     </w:p>
     <w:p>
       <w:pPr>
-        <w:spacing w:before="80" w:after="30"/>
+        <w:spacing w:before="60" w:after="20"/>
       </w:pPr>
       <w:r>
         <w:rPr>
           <w:b/>
           <w:color w:val="E54C09"/>
-          <w:sz w:val="24"/>
+          <w:sz w:val="23"/>
         </w:rPr>
         <w:t>EL PROCESO</w:t>
       </w:r>
@@ -330,7 +488,7 @@
       <w:r>
         <w:rPr>
           <w:b/>
-          <w:sz w:val="20"/>
+          <w:sz w:val="19"/>
         </w:rPr>
         <w:t>1. ¿Aceptas? Firmamos MAÑANA 15 DE SEPTIEMBRE a primera hora (contrato de prestación con confidencialidad). 2. Firmado = manual de venta completo + planilla + piezas EN ESE MISMO MOMENTO. 3. Mañana mismo grabas tus primeros videos y montamos la primera campaña. El reloj del 30 de septiembre corre desde ya — cada día vale.</w:t>
       </w:r>
@@ -350,7 +508,7 @@
     </w:p>
     <w:sectPr>
       <w:pgSz w:w="12240" w:h="15840"/>
-      <w:pgMar w:top="737" w:right="1020" w:bottom="624" w:left="1020" w:header="720" w:footer="720" w:gutter="0"/>
+      <w:pgMar w:top="624" w:right="1020" w:bottom="510" w:left="1020" w:header="720" w:footer="720" w:gutter="0"/>
       <w:cols w:space="720"/>
       <w:docGrid w:linePitch="360"/>
     </w:sectPr>
@@ -723,7 +881,7 @@
     <w:rsid w:val="00FC693F"/>
     <w:rPr>
       <w:rFonts w:ascii="Calibri" w:hAnsi="Calibri"/>
-      <w:sz w:val="20"/>
+      <w:sz w:val="19"/>
     </w:rPr>
   </w:style>
   <w:style w:type="paragraph" w:styleId="Header">

</xml_diff>